<commit_message>
Report done! Here we go!
</commit_message>
<xml_diff>
--- a/Deliverables/FinalReport_Maks_Burchard_240894.docx
+++ b/Deliverables/FinalReport_Maks_Burchard_240894.docx
@@ -112,7 +112,6 @@
         </w:rPr>
         <w:t xml:space="preserve">Please, rename the file to </w:t>
       </w:r>
-      <w:proofErr w:type="spellStart"/>
       <w:r>
         <w:rPr>
           <w:rFonts w:ascii="system-ui" w:eastAsia="system-ui" w:hAnsi="system-ui" w:cs="system-ui"/>
@@ -121,62 +120,7 @@
           <w:szCs w:val="21"/>
           <w:highlight w:val="cyan"/>
         </w:rPr>
-        <w:t>FinalReport</w:t>
-      </w:r>
-      <w:proofErr w:type="spellEnd"/>
-      <w:r>
-        <w:rPr>
-          <w:rFonts w:ascii="system-ui" w:eastAsia="system-ui" w:hAnsi="system-ui" w:cs="system-ui"/>
-          <w:color w:val="222222"/>
-          <w:sz w:val="21"/>
-          <w:szCs w:val="21"/>
-          <w:highlight w:val="cyan"/>
-        </w:rPr>
-        <w:t>_&lt;</w:t>
-      </w:r>
-      <w:proofErr w:type="spellStart"/>
-      <w:r>
-        <w:rPr>
-          <w:rFonts w:ascii="system-ui" w:eastAsia="system-ui" w:hAnsi="system-ui" w:cs="system-ui"/>
-          <w:color w:val="222222"/>
-          <w:sz w:val="21"/>
-          <w:szCs w:val="21"/>
-          <w:highlight w:val="cyan"/>
-        </w:rPr>
-        <w:t>your_name</w:t>
-      </w:r>
-      <w:proofErr w:type="spellEnd"/>
-      <w:r>
-        <w:rPr>
-          <w:rFonts w:ascii="system-ui" w:eastAsia="system-ui" w:hAnsi="system-ui" w:cs="system-ui"/>
-          <w:color w:val="222222"/>
-          <w:sz w:val="21"/>
-          <w:szCs w:val="21"/>
-          <w:highlight w:val="cyan"/>
-        </w:rPr>
-        <w:t>&gt;_&lt;</w:t>
-      </w:r>
-      <w:proofErr w:type="spellStart"/>
-      <w:r>
-        <w:rPr>
-          <w:rFonts w:ascii="system-ui" w:eastAsia="system-ui" w:hAnsi="system-ui" w:cs="system-ui"/>
-          <w:color w:val="222222"/>
-          <w:sz w:val="21"/>
-          <w:szCs w:val="21"/>
-          <w:highlight w:val="cyan"/>
-        </w:rPr>
-        <w:t>studentnumber</w:t>
-      </w:r>
-      <w:proofErr w:type="spellEnd"/>
-      <w:r>
-        <w:rPr>
-          <w:rFonts w:ascii="system-ui" w:eastAsia="system-ui" w:hAnsi="system-ui" w:cs="system-ui"/>
-          <w:color w:val="222222"/>
-          <w:sz w:val="21"/>
-          <w:szCs w:val="21"/>
-          <w:highlight w:val="cyan"/>
-        </w:rPr>
-        <w:t>&gt;.</w:t>
+        <w:t>FinalReport_&lt;your_name&gt;_&lt;studentnumber&gt;.</w:t>
       </w:r>
       <w:r>
         <w:rPr>
@@ -222,27 +166,7 @@
           <w:sz w:val="21"/>
           <w:szCs w:val="21"/>
         </w:rPr>
-        <w:t xml:space="preserve">Upload this template to the 'Deliverables' folder in your </w:t>
-      </w:r>
-      <w:proofErr w:type="spellStart"/>
-      <w:r>
-        <w:rPr>
-          <w:rFonts w:ascii="system-ui" w:eastAsia="system-ui" w:hAnsi="system-ui" w:cs="system-ui"/>
-          <w:color w:val="222222"/>
-          <w:sz w:val="21"/>
-          <w:szCs w:val="21"/>
-        </w:rPr>
-        <w:t>BUas</w:t>
-      </w:r>
-      <w:proofErr w:type="spellEnd"/>
-      <w:r>
-        <w:rPr>
-          <w:rFonts w:ascii="system-ui" w:eastAsia="system-ui" w:hAnsi="system-ui" w:cs="system-ui"/>
-          <w:color w:val="222222"/>
-          <w:sz w:val="21"/>
-          <w:szCs w:val="21"/>
-        </w:rPr>
-        <w:t xml:space="preserve"> GitHub repository.</w:t>
+        <w:t>Upload this template to the 'Deliverables' folder in your BUas GitHub repository.</w:t>
       </w:r>
     </w:p>
     <w:p>
@@ -545,9 +469,8 @@
           <w:sz w:val="20"/>
           <w:szCs w:val="20"/>
         </w:rPr>
-        <w:t xml:space="preserve">linear regression, decision tree regression, gradient boosting regression, and </w:t>
-      </w:r>
-      <w:proofErr w:type="spellStart"/>
+        <w:t xml:space="preserve">linear regression, decision tree regression, gradient boosting regression, and XGBoost regression. </w:t>
+      </w:r>
       <w:r>
         <w:rPr>
           <w:rFonts w:ascii="system-ui" w:eastAsia="system-ui" w:hAnsi="system-ui" w:cs="system-ui"/>
@@ -555,9 +478,8 @@
           <w:sz w:val="20"/>
           <w:szCs w:val="20"/>
         </w:rPr>
-        <w:t>XGBoost</w:t>
-      </w:r>
-      <w:proofErr w:type="spellEnd"/>
+        <w:t xml:space="preserve">After that, I classified the data once again into age, using models such as Logistic Regression, Random Forest Classifier, and K-Nearest </w:t>
+      </w:r>
       <w:r>
         <w:rPr>
           <w:rFonts w:ascii="system-ui" w:eastAsia="system-ui" w:hAnsi="system-ui" w:cs="system-ui"/>
@@ -565,7 +487,7 @@
           <w:sz w:val="20"/>
           <w:szCs w:val="20"/>
         </w:rPr>
-        <w:t xml:space="preserve"> regression. </w:t>
+        <w:t>Neighbour</w:t>
       </w:r>
       <w:r>
         <w:rPr>
@@ -574,7 +496,7 @@
           <w:sz w:val="20"/>
           <w:szCs w:val="20"/>
         </w:rPr>
-        <w:t xml:space="preserve">After that, I classified the data once again into age, using models such as Logistic Regression, Random Forest Classifier, and K-Nearest </w:t>
+        <w:t>. Finally, I clustered the data using K-Means Clustering, Random Hierarchical Clustering, and DBSCAN.</w:t>
       </w:r>
       <w:r>
         <w:rPr>
@@ -583,24 +505,6 @@
           <w:sz w:val="20"/>
           <w:szCs w:val="20"/>
         </w:rPr>
-        <w:t>Neighbour</w:t>
-      </w:r>
-      <w:r>
-        <w:rPr>
-          <w:rFonts w:ascii="system-ui" w:eastAsia="system-ui" w:hAnsi="system-ui" w:cs="system-ui"/>
-          <w:color w:val="3B3B3B"/>
-          <w:sz w:val="20"/>
-          <w:szCs w:val="20"/>
-        </w:rPr>
-        <w:t>. Finally, I clustered the data using K-Means Clustering, Random Hierarchical Clustering, and DBSCAN.</w:t>
-      </w:r>
-      <w:r>
-        <w:rPr>
-          <w:rFonts w:ascii="system-ui" w:eastAsia="system-ui" w:hAnsi="system-ui" w:cs="system-ui"/>
-          <w:color w:val="3B3B3B"/>
-          <w:sz w:val="20"/>
-          <w:szCs w:val="20"/>
-        </w:rPr>
         <w:t xml:space="preserve"> I then evaluated the different models and decided on the best ones for each task.</w:t>
       </w:r>
     </w:p>
@@ -630,19 +534,8 @@
           <w:sz w:val="21"/>
           <w:szCs w:val="21"/>
         </w:rPr>
-        <w:t xml:space="preserve">The </w:t>
-      </w:r>
-      <w:proofErr w:type="gramStart"/>
-      <w:r>
-        <w:rPr>
-          <w:rFonts w:ascii="system-ui" w:eastAsia="system-ui" w:hAnsi="system-ui" w:cs="system-ui"/>
-          <w:color w:val="3B3B3B"/>
-          <w:sz w:val="21"/>
-          <w:szCs w:val="21"/>
-        </w:rPr>
-        <w:t>main focus</w:t>
-      </w:r>
-      <w:proofErr w:type="gramEnd"/>
+        <w:t>The main focus</w:t>
+      </w:r>
       <w:r>
         <w:rPr>
           <w:rFonts w:ascii="system-ui" w:eastAsia="system-ui" w:hAnsi="system-ui" w:cs="system-ui"/>
@@ -767,25 +660,7 @@
           <w:szCs w:val="21"/>
         </w:rPr>
         <w:lastRenderedPageBreak/>
-        <w:t xml:space="preserve">to this step. A bad EDA can lead to assumptions being made that influence models </w:t>
-      </w:r>
-      <w:proofErr w:type="gramStart"/>
-      <w:r>
-        <w:rPr>
-          <w:color w:val="3B3B3B"/>
-          <w:sz w:val="21"/>
-          <w:szCs w:val="21"/>
-        </w:rPr>
-        <w:t>later on</w:t>
-      </w:r>
-      <w:proofErr w:type="gramEnd"/>
-      <w:r>
-        <w:rPr>
-          <w:color w:val="3B3B3B"/>
-          <w:sz w:val="21"/>
-          <w:szCs w:val="21"/>
-        </w:rPr>
-        <w:t xml:space="preserve">. This was the goal of </w:t>
+        <w:t xml:space="preserve">to this step. A bad EDA can lead to assumptions being made that influence models later on. This was the goal of </w:t>
       </w:r>
       <w:r>
         <w:rPr>
@@ -1085,25 +960,7 @@
           <w:sz w:val="21"/>
           <w:szCs w:val="21"/>
         </w:rPr>
-        <w:t xml:space="preserve"> This would be something that needed to be tackled </w:t>
-      </w:r>
-      <w:proofErr w:type="gramStart"/>
-      <w:r>
-        <w:rPr>
-          <w:color w:val="3B3B3B"/>
-          <w:sz w:val="21"/>
-          <w:szCs w:val="21"/>
-        </w:rPr>
-        <w:t>later on</w:t>
-      </w:r>
-      <w:proofErr w:type="gramEnd"/>
-      <w:r>
-        <w:rPr>
-          <w:color w:val="3B3B3B"/>
-          <w:sz w:val="21"/>
-          <w:szCs w:val="21"/>
-        </w:rPr>
-        <w:t>.</w:t>
+        <w:t xml:space="preserve"> This would be something that needed to be tackled later on.</w:t>
       </w:r>
     </w:p>
     <w:p>
@@ -1191,25 +1048,7 @@
           <w:sz w:val="21"/>
           <w:szCs w:val="21"/>
         </w:rPr>
-        <w:t xml:space="preserve">very readable as the same number </w:t>
-      </w:r>
-      <w:proofErr w:type="spellStart"/>
-      <w:r>
-        <w:rPr>
-          <w:color w:val="3B3B3B"/>
-          <w:sz w:val="21"/>
-          <w:szCs w:val="21"/>
-        </w:rPr>
-        <w:t>cam</w:t>
-      </w:r>
-      <w:proofErr w:type="spellEnd"/>
-      <w:r>
-        <w:rPr>
-          <w:color w:val="3B3B3B"/>
-          <w:sz w:val="21"/>
-          <w:szCs w:val="21"/>
-        </w:rPr>
-        <w:t xml:space="preserve"> up multiple times in each column, but it did give a basic overview of correlations between the two columns.</w:t>
+        <w:t>very readable as the same number cam up multiple times in each column, but it did give a basic overview of correlations between the two columns.</w:t>
       </w:r>
     </w:p>
     <w:p>
@@ -1454,27 +1293,7 @@
           <w:sz w:val="21"/>
           <w:szCs w:val="21"/>
         </w:rPr>
-        <w:t xml:space="preserve">After using Pandas to do the EDA, I used NumPy to almost achieve the same results. NumPy had a disadvantage to Pandas in that it only loaded the data in a 1D array instead of the 2D </w:t>
-      </w:r>
-      <w:proofErr w:type="spellStart"/>
-      <w:r>
-        <w:rPr>
-          <w:rFonts w:eastAsia="system-ui" w:cs="system-ui"/>
-          <w:color w:val="3B3B3B"/>
-          <w:sz w:val="21"/>
-          <w:szCs w:val="21"/>
-        </w:rPr>
-        <w:t>dataframe</w:t>
-      </w:r>
-      <w:proofErr w:type="spellEnd"/>
-      <w:r>
-        <w:rPr>
-          <w:rFonts w:eastAsia="system-ui" w:cs="system-ui"/>
-          <w:color w:val="3B3B3B"/>
-          <w:sz w:val="21"/>
-          <w:szCs w:val="21"/>
-        </w:rPr>
-        <w:t>, so I decided to use Pandas to load my data going forwards.</w:t>
+        <w:t>After using Pandas to do the EDA, I used NumPy to almost achieve the same results. NumPy had a disadvantage to Pandas in that it only loaded the data in a 1D array instead of the 2D dataframe, so I decided to use Pandas to load my data going forwards.</w:t>
       </w:r>
     </w:p>
     <w:p>
@@ -1637,67 +1456,7 @@
           <w:szCs w:val="21"/>
         </w:rPr>
         <w:lastRenderedPageBreak/>
-        <w:t>now knew that the “weight” column was formatted in a similar way to the “age” column, and that that was the reason why Python was seeing it as categorical data. The other two things I noticed were that both the “</w:t>
-      </w:r>
-      <w:proofErr w:type="spellStart"/>
-      <w:r>
-        <w:rPr>
-          <w:rFonts w:eastAsia="system-ui" w:cs="system-ui"/>
-          <w:color w:val="3B3B3B"/>
-          <w:sz w:val="21"/>
-          <w:szCs w:val="21"/>
-        </w:rPr>
-        <w:t>examide</w:t>
-      </w:r>
-      <w:proofErr w:type="spellEnd"/>
-      <w:r>
-        <w:rPr>
-          <w:rFonts w:eastAsia="system-ui" w:cs="system-ui"/>
-          <w:color w:val="3B3B3B"/>
-          <w:sz w:val="21"/>
-          <w:szCs w:val="21"/>
-        </w:rPr>
-        <w:t>” and “</w:t>
-      </w:r>
-      <w:proofErr w:type="spellStart"/>
-      <w:r>
-        <w:rPr>
-          <w:rFonts w:eastAsia="system-ui" w:cs="system-ui"/>
-          <w:color w:val="3B3B3B"/>
-          <w:sz w:val="21"/>
-          <w:szCs w:val="21"/>
-        </w:rPr>
-        <w:t>citoglipton</w:t>
-      </w:r>
-      <w:proofErr w:type="spellEnd"/>
-      <w:r>
-        <w:rPr>
-          <w:rFonts w:eastAsia="system-ui" w:cs="system-ui"/>
-          <w:color w:val="3B3B3B"/>
-          <w:sz w:val="21"/>
-          <w:szCs w:val="21"/>
-        </w:rPr>
-        <w:t xml:space="preserve">” columns had one </w:t>
-      </w:r>
-      <w:proofErr w:type="gramStart"/>
-      <w:r>
-        <w:rPr>
-          <w:rFonts w:eastAsia="system-ui" w:cs="system-ui"/>
-          <w:color w:val="3B3B3B"/>
-          <w:sz w:val="21"/>
-          <w:szCs w:val="21"/>
-        </w:rPr>
-        <w:t>value, and</w:t>
-      </w:r>
-      <w:proofErr w:type="gramEnd"/>
-      <w:r>
-        <w:rPr>
-          <w:rFonts w:eastAsia="system-ui" w:cs="system-ui"/>
-          <w:color w:val="3B3B3B"/>
-          <w:sz w:val="21"/>
-          <w:szCs w:val="21"/>
-        </w:rPr>
-        <w:t xml:space="preserve"> would therefore be useless for any task.</w:t>
+        <w:t>now knew that the “weight” column was formatted in a similar way to the “age” column, and that that was the reason why Python was seeing it as categorical data. The other two things I noticed were that both the “examide” and “citoglipton” columns had one value, and would therefore be useless for any task.</w:t>
       </w:r>
     </w:p>
     <w:p/>
@@ -1915,25 +1674,7 @@
           <w:sz w:val="21"/>
           <w:szCs w:val="21"/>
         </w:rPr>
-        <w:t xml:space="preserve">Visualizing data can be a powerful way to explore data. If done correctly, you can easily see patterns, if something is lobsided, outliers and much more. I </w:t>
-      </w:r>
-      <w:proofErr w:type="gramStart"/>
-      <w:r>
-        <w:rPr>
-          <w:color w:val="3B3B3B"/>
-          <w:sz w:val="21"/>
-          <w:szCs w:val="21"/>
-        </w:rPr>
-        <w:t>have to</w:t>
-      </w:r>
-      <w:proofErr w:type="gramEnd"/>
-      <w:r>
-        <w:rPr>
-          <w:color w:val="3B3B3B"/>
-          <w:sz w:val="21"/>
-          <w:szCs w:val="21"/>
-        </w:rPr>
-        <w:t xml:space="preserve"> justify the use of each visualisation in my Creative Brief.</w:t>
+        <w:t>Visualizing data can be a powerful way to explore data. If done correctly, you can easily see patterns, if something is lobsided, outliers and much more. I have to justify the use of each visualisation in my Creative Brief.</w:t>
       </w:r>
     </w:p>
     <w:p>
@@ -1951,7 +1692,231 @@
           <w:sz w:val="21"/>
           <w:szCs w:val="21"/>
         </w:rPr>
-        <w:t>REMEMEBER TO JUSTIFY HERE</w:t>
+        <w:t>The age histogram immediately and clearly shows the distribution of the age of patient. This shows that the dataset is biased towards older patients.</w:t>
+      </w:r>
+    </w:p>
+    <w:p>
+      <w:pPr>
+        <w:ind w:firstLine="720"/>
+        <w:rPr>
+          <w:color w:val="3B3B3B"/>
+          <w:sz w:val="21"/>
+          <w:szCs w:val="21"/>
+        </w:rPr>
+      </w:pPr>
+      <w:r>
+        <w:rPr>
+          <w:color w:val="3B3B3B"/>
+          <w:sz w:val="21"/>
+          <w:szCs w:val="21"/>
+        </w:rPr>
+        <w:t>The gender histogram shows that the female/male ratio is pretty even, with females having the slight edge. It also shows that a third value, Unknown/Invalid, is present in the column in small numbers.</w:t>
+      </w:r>
+    </w:p>
+    <w:p>
+      <w:pPr>
+        <w:ind w:firstLine="720"/>
+        <w:rPr>
+          <w:color w:val="3B3B3B"/>
+          <w:sz w:val="21"/>
+          <w:szCs w:val="21"/>
+        </w:rPr>
+      </w:pPr>
+      <w:r>
+        <w:rPr>
+          <w:color w:val="3B3B3B"/>
+          <w:sz w:val="21"/>
+          <w:szCs w:val="21"/>
+        </w:rPr>
+        <w:t>The time in hospital boxplot shows that the average time patients spent in the hospital is about 42, and that most of them spent between 30 and 60 days in the hospital. There were some notable outliers all the way up to about 130 days.</w:t>
+      </w:r>
+    </w:p>
+    <w:p>
+      <w:pPr>
+        <w:ind w:firstLine="720"/>
+        <w:rPr>
+          <w:color w:val="3B3B3B"/>
+          <w:sz w:val="21"/>
+          <w:szCs w:val="21"/>
+        </w:rPr>
+      </w:pPr>
+      <w:r>
+        <w:rPr>
+          <w:color w:val="3B3B3B"/>
+          <w:sz w:val="21"/>
+          <w:szCs w:val="21"/>
+        </w:rPr>
+        <w:t>The insulin histogram shows that the data in the column is pretty spread out between the 4 values, although “No” appears most often.</w:t>
+      </w:r>
+    </w:p>
+    <w:p>
+      <w:pPr>
+        <w:ind w:firstLine="720"/>
+        <w:rPr>
+          <w:color w:val="3B3B3B"/>
+          <w:sz w:val="21"/>
+          <w:szCs w:val="21"/>
+        </w:rPr>
+      </w:pPr>
+      <w:r>
+        <w:rPr>
+          <w:color w:val="3B3B3B"/>
+          <w:sz w:val="21"/>
+          <w:szCs w:val="21"/>
+        </w:rPr>
+        <w:lastRenderedPageBreak/>
+        <w:t>The metformin histogram shows that the column is mainly filled with “No”  with “Steady” appearing a steady amount while “Up” and “Down” appear very scarcely.</w:t>
+      </w:r>
+    </w:p>
+    <w:p>
+      <w:pPr>
+        <w:ind w:firstLine="720"/>
+        <w:rPr>
+          <w:color w:val="3B3B3B"/>
+          <w:sz w:val="21"/>
+          <w:szCs w:val="21"/>
+        </w:rPr>
+      </w:pPr>
+      <w:r>
+        <w:rPr>
+          <w:color w:val="3B3B3B"/>
+          <w:sz w:val="21"/>
+          <w:szCs w:val="21"/>
+        </w:rPr>
+        <w:t>The readmitted pie chart shows that the majority of patients don’t get readmitted, and between those who do, about 2/3rds get readmitted within 30 days.</w:t>
+      </w:r>
+    </w:p>
+    <w:p>
+      <w:pPr>
+        <w:ind w:firstLine="720"/>
+        <w:rPr>
+          <w:color w:val="3B3B3B"/>
+          <w:sz w:val="21"/>
+          <w:szCs w:val="21"/>
+        </w:rPr>
+      </w:pPr>
+      <w:r>
+        <w:rPr>
+          <w:color w:val="3B3B3B"/>
+          <w:sz w:val="21"/>
+          <w:szCs w:val="21"/>
+        </w:rPr>
+        <w:t>The race histogram shows th</w:t>
+      </w:r>
+      <w:r>
+        <w:rPr>
+          <w:color w:val="3B3B3B"/>
+          <w:sz w:val="21"/>
+          <w:szCs w:val="21"/>
+        </w:rPr>
+        <w:t>at the main race of patients in the dataset is Caucasian, with African American in 2</w:t>
+      </w:r>
+      <w:r>
+        <w:rPr>
+          <w:color w:val="3B3B3B"/>
+          <w:sz w:val="21"/>
+          <w:szCs w:val="21"/>
+          <w:vertAlign w:val="superscript"/>
+        </w:rPr>
+        <w:t>nd</w:t>
+      </w:r>
+      <w:r>
+        <w:rPr>
+          <w:color w:val="3B3B3B"/>
+          <w:sz w:val="21"/>
+          <w:szCs w:val="21"/>
+        </w:rPr>
+        <w:t xml:space="preserve"> and having more data than the remaining 4 values combined.</w:t>
+      </w:r>
+    </w:p>
+    <w:p>
+      <w:pPr>
+        <w:ind w:firstLine="720"/>
+        <w:rPr>
+          <w:color w:val="3B3B3B"/>
+          <w:sz w:val="21"/>
+          <w:szCs w:val="21"/>
+        </w:rPr>
+      </w:pPr>
+      <w:r>
+        <w:rPr>
+          <w:color w:val="3B3B3B"/>
+          <w:sz w:val="21"/>
+          <w:szCs w:val="21"/>
+        </w:rPr>
+        <w:t>The stacked race bar graph shows that the way Caucasians get admitted is more diverse than African Americans. The other four values are too small for me to be able to draw any conclusions from them.</w:t>
+      </w:r>
+    </w:p>
+    <w:p>
+      <w:pPr>
+        <w:ind w:firstLine="720"/>
+        <w:rPr>
+          <w:color w:val="3B3B3B"/>
+          <w:sz w:val="21"/>
+          <w:szCs w:val="21"/>
+        </w:rPr>
+      </w:pPr>
+      <w:r>
+        <w:rPr>
+          <w:color w:val="3B3B3B"/>
+          <w:sz w:val="21"/>
+          <w:szCs w:val="21"/>
+        </w:rPr>
+        <w:t>The medical specialty histogram, while very cluttered, shows that almost 50.000 values, close to half the dataset, are “Pediatrics-Endocrinology”, and the rest of the data is very spread out between the remaining values.</w:t>
+      </w:r>
+    </w:p>
+    <w:p>
+      <w:pPr>
+        <w:ind w:firstLine="720"/>
+        <w:rPr>
+          <w:color w:val="3B3B3B"/>
+          <w:sz w:val="21"/>
+          <w:szCs w:val="21"/>
+        </w:rPr>
+      </w:pPr>
+      <w:r>
+        <w:rPr>
+          <w:color w:val="3B3B3B"/>
+          <w:sz w:val="21"/>
+          <w:szCs w:val="21"/>
+        </w:rPr>
+        <w:t>The stacked medical specialty readmission bar graph shows the ratio between readmitted and non-readmitted patients is similar, no matter what specialty, with only “Emergency/Trauma” having a noticeably higher readmission rate.</w:t>
+      </w:r>
+    </w:p>
+    <w:p>
+      <w:pPr>
+        <w:ind w:firstLine="720"/>
+        <w:rPr>
+          <w:color w:val="3B3B3B"/>
+          <w:sz w:val="21"/>
+          <w:szCs w:val="21"/>
+        </w:rPr>
+      </w:pPr>
+      <w:r>
+        <w:rPr>
+          <w:color w:val="3B3B3B"/>
+          <w:sz w:val="21"/>
+          <w:szCs w:val="21"/>
+        </w:rPr>
+        <w:t>The number of diagnoses histogram shows that an overwhelming number of patients get diagnosed 9 times. The rest of the data is concentrated below that number, while only a small number get diagnosed more than 9 times.</w:t>
+      </w:r>
+    </w:p>
+    <w:p>
+      <w:pPr>
+        <w:ind w:firstLine="720"/>
+        <w:rPr>
+          <w:color w:val="3B3B3B"/>
+          <w:sz w:val="21"/>
+          <w:szCs w:val="21"/>
+        </w:rPr>
+      </w:pPr>
+      <w:r>
+        <w:rPr>
+          <w:color w:val="3B3B3B"/>
+          <w:sz w:val="21"/>
+          <w:szCs w:val="21"/>
+        </w:rPr>
+        <w:t>The final chart is a simple histogram showing the distribution of values in the “diabetesMed” column, showing that the majority of patients get prescribed diabetes medications.</w:t>
       </w:r>
     </w:p>
     <w:p>
@@ -1997,8 +1962,146 @@
         <w:rPr>
           <w:color w:val="auto"/>
         </w:rPr>
+        <w:t>2.2.1: Identify Metadata from the Dataset</w:t>
+      </w:r>
+    </w:p>
+    <w:p>
+      <w:pPr>
+        <w:ind w:firstLine="720"/>
+        <w:rPr>
+          <w:color w:val="3B3B3B"/>
+          <w:sz w:val="21"/>
+          <w:szCs w:val="21"/>
+        </w:rPr>
+      </w:pPr>
+      <w:r>
+        <w:rPr>
+          <w:color w:val="3B3B3B"/>
+          <w:sz w:val="21"/>
+          <w:szCs w:val="21"/>
+        </w:rPr>
+        <w:t xml:space="preserve">As mentioned, </w:t>
+      </w:r>
+      <w:r>
+        <w:rPr>
+          <w:color w:val="3B3B3B"/>
+          <w:sz w:val="21"/>
+          <w:szCs w:val="21"/>
+        </w:rPr>
+        <w:t>m</w:t>
+      </w:r>
+      <w:r>
+        <w:rPr>
+          <w:color w:val="3B3B3B"/>
+          <w:sz w:val="21"/>
+          <w:szCs w:val="21"/>
+        </w:rPr>
+        <w:t>etadata can inform you about the data you are working with, similar to the EDA.</w:t>
+      </w:r>
+      <w:r>
+        <w:rPr>
+          <w:color w:val="3B3B3B"/>
+          <w:sz w:val="21"/>
+          <w:szCs w:val="21"/>
+        </w:rPr>
+        <w:t xml:space="preserve"> It’s simple to understand and easy to work with, and therefore tools have been created to easily produce the metadata.</w:t>
+      </w:r>
+    </w:p>
+    <w:p>
+      <w:pPr>
+        <w:pStyle w:val="Heading3"/>
+        <w:rPr>
+          <w:color w:val="auto"/>
+        </w:rPr>
+      </w:pPr>
+      <w:r>
+        <w:rPr>
+          <w:color w:val="auto"/>
+        </w:rPr>
+        <w:t>2.2.2: Identify Missing Values</w:t>
+      </w:r>
+    </w:p>
+    <w:p>
+      <w:pPr>
+        <w:ind w:firstLine="720"/>
+        <w:rPr>
+          <w:color w:val="3B3B3B"/>
+          <w:sz w:val="21"/>
+          <w:szCs w:val="21"/>
+        </w:rPr>
+      </w:pPr>
+      <w:r>
+        <w:rPr>
+          <w:color w:val="3B3B3B"/>
+          <w:sz w:val="21"/>
+          <w:szCs w:val="21"/>
+        </w:rPr>
+        <w:t>As I stated multiple times before, missing values are no good for machine learning. The goal of this step is to identify which columns have missing data. Luckily, similar to metadata, due to the importance of dealing with missing values, tools have been created specifically for this step. Calculating the % of missing values can help you decide whether to drop the entire column or to proceed with alternate methods</w:t>
+      </w:r>
+      <w:r>
+        <w:rPr>
+          <w:color w:val="3B3B3B"/>
+          <w:sz w:val="21"/>
+          <w:szCs w:val="21"/>
+        </w:rPr>
+        <w:t>, such as filling the data or dropping the rows</w:t>
+      </w:r>
+      <w:r>
+        <w:rPr>
+          <w:color w:val="3B3B3B"/>
+          <w:sz w:val="21"/>
+          <w:szCs w:val="21"/>
+        </w:rPr>
+        <w:t>.</w:t>
+      </w:r>
+      <w:r>
+        <w:rPr>
+          <w:color w:val="3B3B3B"/>
+          <w:sz w:val="21"/>
+          <w:szCs w:val="21"/>
+        </w:rPr>
+        <w:t xml:space="preserve"> </w:t>
+      </w:r>
+      <w:r>
+        <w:rPr>
+          <w:color w:val="3B3B3B"/>
+          <w:sz w:val="21"/>
+          <w:szCs w:val="21"/>
+        </w:rPr>
+        <w:t xml:space="preserve">A simple search for the amount of nan values reveals two columns with nan values: “max_glu_serum” and “A1Cresult”. </w:t>
+      </w:r>
+      <w:r>
+        <w:rPr>
+          <w:color w:val="3B3B3B"/>
+          <w:sz w:val="21"/>
+          <w:szCs w:val="21"/>
+        </w:rPr>
         <w:lastRenderedPageBreak/>
-        <w:t>2.2.1: Identify Metadata from the Dataset</w:t>
+        <w:t>Knowing the shape of the data from previous steps and seeing the amount of nan values here made it immediately clear that both columns had a large percentage of missing values, and after calculations, this turned out to be correct, as the columns had 95% and 83%</w:t>
+      </w:r>
+      <w:r>
+        <w:rPr>
+          <w:color w:val="3B3B3B"/>
+          <w:sz w:val="21"/>
+          <w:szCs w:val="21"/>
+        </w:rPr>
+        <w:t xml:space="preserve"> of their values</w:t>
+      </w:r>
+      <w:r>
+        <w:rPr>
+          <w:color w:val="3B3B3B"/>
+          <w:sz w:val="21"/>
+          <w:szCs w:val="21"/>
+        </w:rPr>
+        <w:t xml:space="preserve"> missing respectively.</w:t>
+      </w:r>
+      <w:r>
+        <w:rPr>
+          <w:color w:val="3B3B3B"/>
+          <w:sz w:val="21"/>
+          <w:szCs w:val="21"/>
+        </w:rPr>
+        <w:t xml:space="preserve"> </w:t>
       </w:r>
     </w:p>
     <w:p>
@@ -2016,208 +2119,6 @@
           <w:sz w:val="21"/>
           <w:szCs w:val="21"/>
         </w:rPr>
-        <w:t xml:space="preserve">As mentioned, </w:t>
-      </w:r>
-      <w:r>
-        <w:rPr>
-          <w:color w:val="3B3B3B"/>
-          <w:sz w:val="21"/>
-          <w:szCs w:val="21"/>
-        </w:rPr>
-        <w:t>m</w:t>
-      </w:r>
-      <w:r>
-        <w:rPr>
-          <w:color w:val="3B3B3B"/>
-          <w:sz w:val="21"/>
-          <w:szCs w:val="21"/>
-        </w:rPr>
-        <w:t xml:space="preserve">etadata can inform you about the data you are working with, </w:t>
-      </w:r>
-      <w:proofErr w:type="gramStart"/>
-      <w:r>
-        <w:rPr>
-          <w:color w:val="3B3B3B"/>
-          <w:sz w:val="21"/>
-          <w:szCs w:val="21"/>
-        </w:rPr>
-        <w:t>similar to</w:t>
-      </w:r>
-      <w:proofErr w:type="gramEnd"/>
-      <w:r>
-        <w:rPr>
-          <w:color w:val="3B3B3B"/>
-          <w:sz w:val="21"/>
-          <w:szCs w:val="21"/>
-        </w:rPr>
-        <w:t xml:space="preserve"> the EDA.</w:t>
-      </w:r>
-      <w:r>
-        <w:rPr>
-          <w:color w:val="3B3B3B"/>
-          <w:sz w:val="21"/>
-          <w:szCs w:val="21"/>
-        </w:rPr>
-        <w:t xml:space="preserve"> It’s simple to understand and easy to work with, and therefore tools have been created to easily produce the metadata.</w:t>
-      </w:r>
-    </w:p>
-    <w:p>
-      <w:pPr>
-        <w:pStyle w:val="Heading3"/>
-        <w:rPr>
-          <w:color w:val="auto"/>
-        </w:rPr>
-      </w:pPr>
-      <w:r>
-        <w:rPr>
-          <w:color w:val="auto"/>
-        </w:rPr>
-        <w:t>2.2.2: Identify Missing Values</w:t>
-      </w:r>
-    </w:p>
-    <w:p>
-      <w:pPr>
-        <w:ind w:firstLine="720"/>
-        <w:rPr>
-          <w:color w:val="3B3B3B"/>
-          <w:sz w:val="21"/>
-          <w:szCs w:val="21"/>
-        </w:rPr>
-      </w:pPr>
-      <w:r>
-        <w:rPr>
-          <w:color w:val="3B3B3B"/>
-          <w:sz w:val="21"/>
-          <w:szCs w:val="21"/>
-        </w:rPr>
-        <w:t xml:space="preserve">As I stated multiple times before, missing values are no good for machine learning. The goal of this step is to identify which columns have missing data. Luckily, </w:t>
-      </w:r>
-      <w:proofErr w:type="gramStart"/>
-      <w:r>
-        <w:rPr>
-          <w:color w:val="3B3B3B"/>
-          <w:sz w:val="21"/>
-          <w:szCs w:val="21"/>
-        </w:rPr>
-        <w:t>similar to</w:t>
-      </w:r>
-      <w:proofErr w:type="gramEnd"/>
-      <w:r>
-        <w:rPr>
-          <w:color w:val="3B3B3B"/>
-          <w:sz w:val="21"/>
-          <w:szCs w:val="21"/>
-        </w:rPr>
-        <w:t xml:space="preserve"> metadata, due to the importance of dealing with missing values, tools have been created specifically for this step. Calculating the % of missing values can help you decide whether to drop the entire column or to proceed with alternate methods</w:t>
-      </w:r>
-      <w:r>
-        <w:rPr>
-          <w:color w:val="3B3B3B"/>
-          <w:sz w:val="21"/>
-          <w:szCs w:val="21"/>
-        </w:rPr>
-        <w:t>, such as filling the data or dropping the rows</w:t>
-      </w:r>
-      <w:r>
-        <w:rPr>
-          <w:color w:val="3B3B3B"/>
-          <w:sz w:val="21"/>
-          <w:szCs w:val="21"/>
-        </w:rPr>
-        <w:t>.</w:t>
-      </w:r>
-      <w:r>
-        <w:rPr>
-          <w:color w:val="3B3B3B"/>
-          <w:sz w:val="21"/>
-          <w:szCs w:val="21"/>
-        </w:rPr>
-        <w:t xml:space="preserve"> </w:t>
-      </w:r>
-      <w:r>
-        <w:rPr>
-          <w:color w:val="3B3B3B"/>
-          <w:sz w:val="21"/>
-          <w:szCs w:val="21"/>
-        </w:rPr>
-        <w:t xml:space="preserve">A simple search </w:t>
-      </w:r>
-      <w:proofErr w:type="gramStart"/>
-      <w:r>
-        <w:rPr>
-          <w:color w:val="3B3B3B"/>
-          <w:sz w:val="21"/>
-          <w:szCs w:val="21"/>
-        </w:rPr>
-        <w:t>for the amount of</w:t>
-      </w:r>
-      <w:proofErr w:type="gramEnd"/>
-      <w:r>
-        <w:rPr>
-          <w:color w:val="3B3B3B"/>
-          <w:sz w:val="21"/>
-          <w:szCs w:val="21"/>
-        </w:rPr>
-        <w:t xml:space="preserve"> nan values reveals two columns with nan values: “</w:t>
-      </w:r>
-      <w:proofErr w:type="spellStart"/>
-      <w:r>
-        <w:rPr>
-          <w:color w:val="3B3B3B"/>
-          <w:sz w:val="21"/>
-          <w:szCs w:val="21"/>
-        </w:rPr>
-        <w:t>max_glu_serum</w:t>
-      </w:r>
-      <w:proofErr w:type="spellEnd"/>
-      <w:r>
-        <w:rPr>
-          <w:color w:val="3B3B3B"/>
-          <w:sz w:val="21"/>
-          <w:szCs w:val="21"/>
-        </w:rPr>
-        <w:t>” and “A1Cresult”. Knowing the shape of the data from previous steps and seeing the amount of nan values here made it immediately clear that both columns had a large percentage of missing values, and after calculations, this turned out to be correct, as the columns had 95% and 83%</w:t>
-      </w:r>
-      <w:r>
-        <w:rPr>
-          <w:color w:val="3B3B3B"/>
-          <w:sz w:val="21"/>
-          <w:szCs w:val="21"/>
-        </w:rPr>
-        <w:t xml:space="preserve"> of their values</w:t>
-      </w:r>
-      <w:r>
-        <w:rPr>
-          <w:color w:val="3B3B3B"/>
-          <w:sz w:val="21"/>
-          <w:szCs w:val="21"/>
-        </w:rPr>
-        <w:t xml:space="preserve"> missing respectively.</w:t>
-      </w:r>
-      <w:r>
-        <w:rPr>
-          <w:color w:val="3B3B3B"/>
-          <w:sz w:val="21"/>
-          <w:szCs w:val="21"/>
-        </w:rPr>
-        <w:t xml:space="preserve"> </w:t>
-      </w:r>
-    </w:p>
-    <w:p>
-      <w:pPr>
-        <w:ind w:firstLine="720"/>
-        <w:rPr>
-          <w:color w:val="3B3B3B"/>
-          <w:sz w:val="21"/>
-          <w:szCs w:val="21"/>
-        </w:rPr>
-      </w:pPr>
-      <w:r>
-        <w:rPr>
-          <w:color w:val="3B3B3B"/>
-          <w:sz w:val="21"/>
-          <w:szCs w:val="21"/>
-        </w:rPr>
         <w:t>However, the analysis</w:t>
       </w:r>
       <w:r>
@@ -2226,18 +2127,8 @@
           <w:sz w:val="21"/>
           <w:szCs w:val="21"/>
         </w:rPr>
-        <w:t xml:space="preserve"> </w:t>
-      </w:r>
-      <w:proofErr w:type="gramStart"/>
-      <w:r>
-        <w:rPr>
-          <w:color w:val="3B3B3B"/>
-          <w:sz w:val="21"/>
-          <w:szCs w:val="21"/>
-        </w:rPr>
-        <w:t>I</w:t>
-      </w:r>
-      <w:proofErr w:type="gramEnd"/>
+        <w:t xml:space="preserve"> I</w:t>
+      </w:r>
       <w:r>
         <w:rPr>
           <w:color w:val="3B3B3B"/>
@@ -2295,43 +2186,7 @@
           <w:sz w:val="21"/>
           <w:szCs w:val="21"/>
         </w:rPr>
-        <w:t>The big one was “weight”, consisting of 97% of missing values. The columns “</w:t>
-      </w:r>
-      <w:proofErr w:type="spellStart"/>
-      <w:r>
-        <w:rPr>
-          <w:color w:val="3B3B3B"/>
-          <w:sz w:val="21"/>
-          <w:szCs w:val="21"/>
-        </w:rPr>
-        <w:t>payer_code</w:t>
-      </w:r>
-      <w:proofErr w:type="spellEnd"/>
-      <w:r>
-        <w:rPr>
-          <w:color w:val="3B3B3B"/>
-          <w:sz w:val="21"/>
-          <w:szCs w:val="21"/>
-        </w:rPr>
-        <w:t>” and “</w:t>
-      </w:r>
-      <w:proofErr w:type="spellStart"/>
-      <w:r>
-        <w:rPr>
-          <w:color w:val="3B3B3B"/>
-          <w:sz w:val="21"/>
-          <w:szCs w:val="21"/>
-        </w:rPr>
-        <w:t>medical_specialty</w:t>
-      </w:r>
-      <w:proofErr w:type="spellEnd"/>
-      <w:r>
-        <w:rPr>
-          <w:color w:val="3B3B3B"/>
-          <w:sz w:val="21"/>
-          <w:szCs w:val="21"/>
-        </w:rPr>
-        <w:t>” also had large amounts of missing values with 40% and 49% respectively. Other columns such as “race”, “diag_1”, “diag_2”, and “diag_3” also had missing values, but in small amounts, as none of those exceeded 2,5%.</w:t>
+        <w:t>The big one was “weight”, consisting of 97% of missing values. The columns “payer_code” and “medical_specialty” also had large amounts of missing values with 40% and 49% respectively. Other columns such as “race”, “diag_1”, “diag_2”, and “diag_3” also had missing values, but in small amounts, as none of those exceeded 2,5%.</w:t>
       </w:r>
     </w:p>
     <w:p>
@@ -2565,25 +2420,7 @@
           <w:sz w:val="21"/>
           <w:szCs w:val="21"/>
         </w:rPr>
-        <w:t xml:space="preserve"> </w:t>
-      </w:r>
-      <w:proofErr w:type="gramStart"/>
-      <w:r>
-        <w:rPr>
-          <w:color w:val="3B3B3B"/>
-          <w:sz w:val="21"/>
-          <w:szCs w:val="21"/>
-        </w:rPr>
-        <w:t>has to</w:t>
-      </w:r>
-      <w:proofErr w:type="gramEnd"/>
-      <w:r>
-        <w:rPr>
-          <w:color w:val="3B3B3B"/>
-          <w:sz w:val="21"/>
-          <w:szCs w:val="21"/>
-        </w:rPr>
-        <w:t xml:space="preserve"> come after the processing steps as both the train and test datasets need to be in the same format, but before any work with models to prevent data leakage</w:t>
+        <w:t xml:space="preserve"> has to come after the processing steps as both the train and test datasets need to be in the same format, but before any work with models to prevent data leakage</w:t>
       </w:r>
       <w:r>
         <w:rPr>
@@ -2612,7 +2449,6 @@
           <w:sz w:val="40"/>
           <w:szCs w:val="40"/>
         </w:rPr>
-        <w:lastRenderedPageBreak/>
         <w:t xml:space="preserve">Machine Learning </w:t>
       </w:r>
       <w:r>
@@ -2768,6 +2604,7 @@
           <w:sz w:val="21"/>
           <w:szCs w:val="21"/>
         </w:rPr>
+        <w:lastRenderedPageBreak/>
         <w:t xml:space="preserve">Due to the same reason as stated above and because you had to process the data after you loaded it, I put the pre-processing steps here as well. </w:t>
       </w:r>
       <w:r>
@@ -3099,17 +2936,7 @@
           <w:sz w:val="21"/>
           <w:szCs w:val="21"/>
         </w:rPr>
-        <w:t xml:space="preserve">model for comparison using the MAE and MSE scores. Just like </w:t>
-      </w:r>
-      <w:r>
-        <w:rPr>
-          <w:rFonts w:eastAsia="system-ui" w:cs="system-ui"/>
-          <w:color w:val="3B3B3B"/>
-          <w:sz w:val="21"/>
-          <w:szCs w:val="21"/>
-        </w:rPr>
-        <w:lastRenderedPageBreak/>
-        <w:t>with the decision tree regressor, I did a small amount of manual hyperparameter tuning on the model.</w:t>
+        <w:t>model for comparison using the MAE and MSE scores. Just like with the decision tree regressor, I did a small amount of manual hyperparameter tuning on the model.</w:t>
       </w:r>
     </w:p>
     <w:p>
@@ -3125,23 +2952,7 @@
           <w:rFonts w:eastAsia="system-ui"/>
           <w:color w:val="auto"/>
         </w:rPr>
-        <w:t xml:space="preserve">3.1.6: Implement </w:t>
-      </w:r>
-      <w:proofErr w:type="spellStart"/>
-      <w:r>
-        <w:rPr>
-          <w:rFonts w:eastAsia="system-ui"/>
-          <w:color w:val="auto"/>
-        </w:rPr>
-        <w:t>XGBoost</w:t>
-      </w:r>
-      <w:proofErr w:type="spellEnd"/>
-      <w:r>
-        <w:rPr>
-          <w:rFonts w:eastAsia="system-ui"/>
-          <w:color w:val="auto"/>
-        </w:rPr>
-        <w:t xml:space="preserve"> Regression</w:t>
+        <w:t>3.1.6: Implement XGBoost Regression</w:t>
       </w:r>
     </w:p>
     <w:p>
@@ -3162,19 +2973,8 @@
           <w:sz w:val="21"/>
           <w:szCs w:val="21"/>
         </w:rPr>
-        <w:t xml:space="preserve">The fourth and final model I implemented for regression was </w:t>
-      </w:r>
-      <w:proofErr w:type="spellStart"/>
-      <w:r>
-        <w:rPr>
-          <w:rFonts w:eastAsia="system-ui" w:cs="system-ui"/>
-          <w:color w:val="3B3B3B"/>
-          <w:sz w:val="21"/>
-          <w:szCs w:val="21"/>
-        </w:rPr>
-        <w:t>XGBoost</w:t>
-      </w:r>
-      <w:proofErr w:type="spellEnd"/>
+        <w:t>The fourth and final model I implemented for regression was XGBoost</w:t>
+      </w:r>
       <w:r>
         <w:rPr>
           <w:rFonts w:eastAsia="system-ui" w:cs="system-ui"/>
@@ -3282,27 +3082,7 @@
           <w:sz w:val="21"/>
           <w:szCs w:val="21"/>
         </w:rPr>
-        <w:t xml:space="preserve">As </w:t>
-      </w:r>
-      <w:proofErr w:type="gramStart"/>
-      <w:r>
-        <w:rPr>
-          <w:rFonts w:eastAsia="system-ui" w:cs="system-ui"/>
-          <w:color w:val="3B3B3B"/>
-          <w:sz w:val="21"/>
-          <w:szCs w:val="21"/>
-        </w:rPr>
-        <w:t>stated</w:t>
-      </w:r>
-      <w:proofErr w:type="gramEnd"/>
-      <w:r>
-        <w:rPr>
-          <w:rFonts w:eastAsia="system-ui" w:cs="system-ui"/>
-          <w:color w:val="3B3B3B"/>
-          <w:sz w:val="21"/>
-          <w:szCs w:val="21"/>
-        </w:rPr>
-        <w:t xml:space="preserve"> before in my justification of the scatter plot of the linear regressor output, visualising the output of the model can give you insights in how it works. The same is true here: You can see that all </w:t>
+        <w:t xml:space="preserve">As stated before in my justification of the scatter plot of the linear regressor output, visualising the output of the model can give you insights in how it works. The same is true here: You can see that all </w:t>
       </w:r>
       <w:r>
         <w:rPr>
@@ -3320,47 +3100,17 @@
           <w:sz w:val="21"/>
           <w:szCs w:val="21"/>
         </w:rPr>
-        <w:t xml:space="preserve"> have a spike between 0.6 and 0.7, although their distribution are different. From the visuals </w:t>
-      </w:r>
-      <w:proofErr w:type="gramStart"/>
-      <w:r>
-        <w:rPr>
-          <w:rFonts w:eastAsia="system-ui" w:cs="system-ui"/>
-          <w:color w:val="3B3B3B"/>
-          <w:sz w:val="21"/>
-          <w:szCs w:val="21"/>
-        </w:rPr>
-        <w:t>it can be seen that the</w:t>
-      </w:r>
-      <w:proofErr w:type="gramEnd"/>
-      <w:r>
-        <w:rPr>
-          <w:rFonts w:eastAsia="system-ui" w:cs="system-ui"/>
-          <w:color w:val="3B3B3B"/>
-          <w:sz w:val="21"/>
-          <w:szCs w:val="21"/>
-        </w:rPr>
-        <w:t xml:space="preserve"> decision tree regressor predicts values between 0.2 and 0.9 while the gradient boosting regressor predicts between 0.5 and 0.8. The </w:t>
-      </w:r>
-      <w:proofErr w:type="spellStart"/>
-      <w:r>
-        <w:rPr>
-          <w:rFonts w:eastAsia="system-ui" w:cs="system-ui"/>
-          <w:color w:val="3B3B3B"/>
-          <w:sz w:val="21"/>
-          <w:szCs w:val="21"/>
-        </w:rPr>
-        <w:t>XGBoost</w:t>
-      </w:r>
-      <w:proofErr w:type="spellEnd"/>
-      <w:r>
-        <w:rPr>
-          <w:rFonts w:eastAsia="system-ui" w:cs="system-ui"/>
-          <w:color w:val="3B3B3B"/>
-          <w:sz w:val="21"/>
-          <w:szCs w:val="21"/>
-        </w:rPr>
-        <w:t xml:space="preserve"> regressor ha</w:t>
+        <w:t xml:space="preserve"> have a spike between 0.6 and 0.7, although their distribution are different. From the visuals it can be seen that the decision tree regressor predicts values between 0.2 and 0.9 while </w:t>
+      </w:r>
+      <w:r>
+        <w:rPr>
+          <w:rFonts w:eastAsia="system-ui" w:cs="system-ui"/>
+          <w:color w:val="3B3B3B"/>
+          <w:sz w:val="21"/>
+          <w:szCs w:val="21"/>
+        </w:rPr>
+        <w:lastRenderedPageBreak/>
+        <w:t>the gradient boosting regressor predicts between 0.5 and 0.8. The XGBoost regressor ha</w:t>
       </w:r>
       <w:r>
         <w:rPr>
@@ -3469,27 +3219,7 @@
           <w:sz w:val="21"/>
           <w:szCs w:val="21"/>
         </w:rPr>
-        <w:t xml:space="preserve"> from each model. The decision tree just slightly beats gradient boosting and linear regression, while </w:t>
-      </w:r>
-      <w:proofErr w:type="spellStart"/>
-      <w:r>
-        <w:rPr>
-          <w:rFonts w:eastAsia="system-ui" w:cs="system-ui"/>
-          <w:color w:val="3B3B3B"/>
-          <w:sz w:val="21"/>
-          <w:szCs w:val="21"/>
-        </w:rPr>
-        <w:t>XGBoost</w:t>
-      </w:r>
-      <w:proofErr w:type="spellEnd"/>
-      <w:r>
-        <w:rPr>
-          <w:rFonts w:eastAsia="system-ui" w:cs="system-ui"/>
-          <w:color w:val="3B3B3B"/>
-          <w:sz w:val="21"/>
-          <w:szCs w:val="21"/>
-        </w:rPr>
-        <w:t xml:space="preserve"> is far behind.</w:t>
+        <w:t xml:space="preserve"> from each model. The decision tree just slightly beats gradient boosting and linear regression, while XGBoost is far behind.</w:t>
       </w:r>
       <w:r>
         <w:rPr>
@@ -3585,27 +3315,7 @@
           <w:sz w:val="21"/>
           <w:szCs w:val="21"/>
         </w:rPr>
-        <w:t xml:space="preserve">The second of the three tasks is classification, where the goal is to classify a value to a certain label based </w:t>
-      </w:r>
-      <w:proofErr w:type="gramStart"/>
-      <w:r>
-        <w:rPr>
-          <w:rFonts w:eastAsia="system-ui" w:cs="system-ui"/>
-          <w:color w:val="3B3B3B"/>
-          <w:sz w:val="21"/>
-          <w:szCs w:val="21"/>
-        </w:rPr>
-        <w:t>off of</w:t>
-      </w:r>
-      <w:proofErr w:type="gramEnd"/>
-      <w:r>
-        <w:rPr>
-          <w:rFonts w:eastAsia="system-ui" w:cs="system-ui"/>
-          <w:color w:val="3B3B3B"/>
-          <w:sz w:val="21"/>
-          <w:szCs w:val="21"/>
-        </w:rPr>
-        <w:t xml:space="preserve"> the other features.</w:t>
+        <w:t>The second of the three tasks is classification, where the goal is to classify a value to a certain label based off of the other features.</w:t>
       </w:r>
     </w:p>
     <w:p>
@@ -3758,7 +3468,6 @@
           <w:rFonts w:eastAsia="system-ui"/>
           <w:color w:val="auto"/>
         </w:rPr>
-        <w:lastRenderedPageBreak/>
         <w:t>3.2.4: Implement a Random Forest Classifier as a Non-linear Baseline</w:t>
       </w:r>
     </w:p>
@@ -3782,25 +3491,14 @@
         </w:rPr>
         <w:t xml:space="preserve">The second model for classification was the random forest classifier. </w:t>
       </w:r>
-      <w:proofErr w:type="gramStart"/>
-      <w:r>
-        <w:rPr>
-          <w:rFonts w:eastAsia="system-ui" w:cs="system-ui"/>
-          <w:color w:val="3B3B3B"/>
-          <w:sz w:val="21"/>
-          <w:szCs w:val="21"/>
-        </w:rPr>
-        <w:t>Similar to</w:t>
-      </w:r>
-      <w:proofErr w:type="gramEnd"/>
-      <w:r>
-        <w:rPr>
-          <w:rFonts w:eastAsia="system-ui" w:cs="system-ui"/>
-          <w:color w:val="3B3B3B"/>
-          <w:sz w:val="21"/>
-          <w:szCs w:val="21"/>
-        </w:rPr>
-        <w:t xml:space="preserve"> the first model, I trained it and then let it classify the data before evaluating it using the 4 scores mentioned before.</w:t>
+      <w:r>
+        <w:rPr>
+          <w:rFonts w:eastAsia="system-ui" w:cs="system-ui"/>
+          <w:color w:val="3B3B3B"/>
+          <w:sz w:val="21"/>
+          <w:szCs w:val="21"/>
+        </w:rPr>
+        <w:t>Similar to the first model, I trained it and then let it classify the data before evaluating it using the 4 scores mentioned before.</w:t>
       </w:r>
     </w:p>
     <w:p>
@@ -3891,58 +3589,7 @@
           <w:sz w:val="21"/>
           <w:szCs w:val="21"/>
         </w:rPr>
-        <w:t xml:space="preserve">As is immediately visible from the code, I did hyperparameter tuning on the algorithm for the </w:t>
-      </w:r>
-      <w:proofErr w:type="spellStart"/>
-      <w:r>
-        <w:rPr>
-          <w:rFonts w:eastAsia="system-ui" w:cs="system-ui"/>
-          <w:color w:val="3B3B3B"/>
-          <w:sz w:val="21"/>
-          <w:szCs w:val="21"/>
-        </w:rPr>
-        <w:t>n_</w:t>
-      </w:r>
-      <w:proofErr w:type="gramStart"/>
-      <w:r>
-        <w:rPr>
-          <w:rFonts w:eastAsia="system-ui" w:cs="system-ui"/>
-          <w:color w:val="3B3B3B"/>
-          <w:sz w:val="21"/>
-          <w:szCs w:val="21"/>
-        </w:rPr>
-        <w:t>neighbours</w:t>
-      </w:r>
-      <w:proofErr w:type="spellEnd"/>
-      <w:proofErr w:type="gramEnd"/>
-      <w:r>
-        <w:rPr>
-          <w:rFonts w:eastAsia="system-ui" w:cs="system-ui"/>
-          <w:color w:val="3B3B3B"/>
-          <w:sz w:val="21"/>
-          <w:szCs w:val="21"/>
-        </w:rPr>
-        <w:t xml:space="preserve"> parameter. I calculated the </w:t>
-      </w:r>
-      <w:proofErr w:type="gramStart"/>
-      <w:r>
-        <w:rPr>
-          <w:rFonts w:eastAsia="system-ui" w:cs="system-ui"/>
-          <w:color w:val="3B3B3B"/>
-          <w:sz w:val="21"/>
-          <w:szCs w:val="21"/>
-        </w:rPr>
-        <w:t>four evaluation</w:t>
-      </w:r>
-      <w:proofErr w:type="gramEnd"/>
-      <w:r>
-        <w:rPr>
-          <w:rFonts w:eastAsia="system-ui" w:cs="system-ui"/>
-          <w:color w:val="3B3B3B"/>
-          <w:sz w:val="21"/>
-          <w:szCs w:val="21"/>
-        </w:rPr>
-        <w:t xml:space="preserve"> metrics for each value of the parameter between 2 and 20 and then visualised it in a graph to easily tell which one had the highest metrics. From said visual, it can be concluded that the optimal value for the parameter is 17,</w:t>
+        <w:t>As is immediately visible from the code, I did hyperparameter tuning on the algorithm for the n_neighbours parameter. I calculated the four evaluation metrics for each value of the parameter between 2 and 20 and then visualised it in a graph to easily tell which one had the highest metrics. From said visual, it can be concluded that the optimal value for the parameter is 17,</w:t>
       </w:r>
       <w:r>
         <w:rPr>
@@ -3994,6 +3641,7 @@
           <w:rFonts w:eastAsia="system-ui"/>
           <w:color w:val="auto"/>
         </w:rPr>
+        <w:lastRenderedPageBreak/>
         <w:t>3.2.6: Evaluation and Model Comparison</w:t>
       </w:r>
     </w:p>
@@ -4015,27 +3663,7 @@
           <w:sz w:val="21"/>
           <w:szCs w:val="21"/>
         </w:rPr>
-        <w:t xml:space="preserve">Once again, evaluation and comparison </w:t>
-      </w:r>
-      <w:proofErr w:type="gramStart"/>
-      <w:r>
-        <w:rPr>
-          <w:rFonts w:eastAsia="system-ui" w:cs="system-ui"/>
-          <w:color w:val="3B3B3B"/>
-          <w:sz w:val="21"/>
-          <w:szCs w:val="21"/>
-        </w:rPr>
-        <w:t>is</w:t>
-      </w:r>
-      <w:proofErr w:type="gramEnd"/>
-      <w:r>
-        <w:rPr>
-          <w:rFonts w:eastAsia="system-ui" w:cs="system-ui"/>
-          <w:color w:val="3B3B3B"/>
-          <w:sz w:val="21"/>
-          <w:szCs w:val="21"/>
-        </w:rPr>
-        <w:t xml:space="preserve"> important to conclude which model is best for the task. I used the four evaluations I calculated and compared them to decide that the best model seemed to be the random forest </w:t>
+        <w:t xml:space="preserve">Once again, evaluation and comparison is important to conclude which model is best for the task. I used the four evaluations I calculated and compared them to decide that the best model seemed to be the random forest </w:t>
       </w:r>
       <w:r>
         <w:rPr>
@@ -4217,7 +3845,6 @@
           <w:rFonts w:eastAsia="system-ui"/>
           <w:color w:val="auto"/>
         </w:rPr>
-        <w:lastRenderedPageBreak/>
         <w:t>3.3.4: Implement Random Hierarchical Clustering</w:t>
       </w:r>
     </w:p>
@@ -4346,6 +3973,7 @@
           <w:rFonts w:eastAsia="system-ui"/>
           <w:color w:val="auto"/>
         </w:rPr>
+        <w:lastRenderedPageBreak/>
         <w:t>3.3.6: Evaluation and Model Comparison</w:t>
       </w:r>
     </w:p>
@@ -4574,37 +4202,7 @@
           <w:sz w:val="21"/>
           <w:szCs w:val="21"/>
         </w:rPr>
-        <w:t xml:space="preserve"> Secondly, other models which don’t </w:t>
-      </w:r>
-      <w:r>
-        <w:rPr>
-          <w:rFonts w:eastAsia="system-ui" w:cs="system-ui"/>
-          <w:color w:val="3B3B3B"/>
-          <w:sz w:val="21"/>
-          <w:szCs w:val="21"/>
-        </w:rPr>
-        <w:lastRenderedPageBreak/>
-        <w:t xml:space="preserve">work on distance </w:t>
-      </w:r>
-      <w:proofErr w:type="gramStart"/>
-      <w:r>
-        <w:rPr>
-          <w:rFonts w:eastAsia="system-ui" w:cs="system-ui"/>
-          <w:color w:val="3B3B3B"/>
-          <w:sz w:val="21"/>
-          <w:szCs w:val="21"/>
-        </w:rPr>
-        <w:t>can</w:t>
-      </w:r>
-      <w:proofErr w:type="gramEnd"/>
-      <w:r>
-        <w:rPr>
-          <w:rFonts w:eastAsia="system-ui" w:cs="system-ui"/>
-          <w:color w:val="3B3B3B"/>
-          <w:sz w:val="21"/>
-          <w:szCs w:val="21"/>
-        </w:rPr>
-        <w:t xml:space="preserve"> overfit to a column with large values and be less efficient in predicting or classifying values.</w:t>
+        <w:t xml:space="preserve"> Secondly, other models which don’t work on distance can overfit to a column with large values and be less efficient in predicting or classifying values.</w:t>
       </w:r>
     </w:p>
     <w:p>
@@ -4650,167 +4248,7 @@
           <w:sz w:val="21"/>
           <w:szCs w:val="21"/>
         </w:rPr>
-        <w:t>a combination of the importance identified by the random forest classifier (</w:t>
-      </w:r>
-      <w:proofErr w:type="spellStart"/>
-      <w:r>
-        <w:rPr>
-          <w:rFonts w:eastAsia="system-ui" w:cs="system-ui"/>
-          <w:color w:val="3B3B3B"/>
-          <w:sz w:val="21"/>
-          <w:szCs w:val="21"/>
-        </w:rPr>
-        <w:t>rfc</w:t>
-      </w:r>
-      <w:proofErr w:type="spellEnd"/>
-      <w:r>
-        <w:rPr>
-          <w:rFonts w:eastAsia="system-ui" w:cs="system-ui"/>
-          <w:color w:val="3B3B3B"/>
-          <w:sz w:val="21"/>
-          <w:szCs w:val="21"/>
-        </w:rPr>
-        <w:t xml:space="preserve">) and </w:t>
-      </w:r>
-      <w:proofErr w:type="spellStart"/>
-      <w:r>
-        <w:rPr>
-          <w:rFonts w:eastAsia="system-ui" w:cs="system-ui"/>
-          <w:color w:val="3B3B3B"/>
-          <w:sz w:val="21"/>
-          <w:szCs w:val="21"/>
-        </w:rPr>
-        <w:t>XGBoost</w:t>
-      </w:r>
-      <w:proofErr w:type="spellEnd"/>
-      <w:r>
-        <w:rPr>
-          <w:rFonts w:eastAsia="system-ui" w:cs="system-ui"/>
-          <w:color w:val="3B3B3B"/>
-          <w:sz w:val="21"/>
-          <w:szCs w:val="21"/>
-        </w:rPr>
-        <w:t xml:space="preserve"> regressor. I divided the importance as given by the </w:t>
-      </w:r>
-      <w:proofErr w:type="spellStart"/>
-      <w:r>
-        <w:rPr>
-          <w:rFonts w:eastAsia="system-ui" w:cs="system-ui"/>
-          <w:color w:val="3B3B3B"/>
-          <w:sz w:val="21"/>
-          <w:szCs w:val="21"/>
-        </w:rPr>
-        <w:t>rfc</w:t>
-      </w:r>
-      <w:proofErr w:type="spellEnd"/>
-      <w:r>
-        <w:rPr>
-          <w:rFonts w:eastAsia="system-ui" w:cs="system-ui"/>
-          <w:color w:val="3B3B3B"/>
-          <w:sz w:val="21"/>
-          <w:szCs w:val="21"/>
-        </w:rPr>
-        <w:t xml:space="preserve"> by the importance given by </w:t>
-      </w:r>
-      <w:proofErr w:type="spellStart"/>
-      <w:r>
-        <w:rPr>
-          <w:rFonts w:eastAsia="system-ui" w:cs="system-ui"/>
-          <w:color w:val="3B3B3B"/>
-          <w:sz w:val="21"/>
-          <w:szCs w:val="21"/>
-        </w:rPr>
-        <w:t>XGBoost</w:t>
-      </w:r>
-      <w:proofErr w:type="spellEnd"/>
-      <w:r>
-        <w:rPr>
-          <w:rFonts w:eastAsia="system-ui" w:cs="system-ui"/>
-          <w:color w:val="3B3B3B"/>
-          <w:sz w:val="21"/>
-          <w:szCs w:val="21"/>
-        </w:rPr>
-        <w:t xml:space="preserve">. This created a bit of a problem as </w:t>
-      </w:r>
-      <w:proofErr w:type="spellStart"/>
-      <w:r>
-        <w:rPr>
-          <w:rFonts w:eastAsia="system-ui" w:cs="system-ui"/>
-          <w:color w:val="3B3B3B"/>
-          <w:sz w:val="21"/>
-          <w:szCs w:val="21"/>
-        </w:rPr>
-        <w:t>XGBoost</w:t>
-      </w:r>
-      <w:proofErr w:type="spellEnd"/>
-      <w:r>
-        <w:rPr>
-          <w:rFonts w:eastAsia="system-ui" w:cs="system-ui"/>
-          <w:color w:val="3B3B3B"/>
-          <w:sz w:val="21"/>
-          <w:szCs w:val="21"/>
-        </w:rPr>
-        <w:t xml:space="preserve"> can remove features from its importance list while </w:t>
-      </w:r>
-      <w:proofErr w:type="spellStart"/>
-      <w:r>
-        <w:rPr>
-          <w:rFonts w:eastAsia="system-ui" w:cs="system-ui"/>
-          <w:color w:val="3B3B3B"/>
-          <w:sz w:val="21"/>
-          <w:szCs w:val="21"/>
-        </w:rPr>
-        <w:t>rfc</w:t>
-      </w:r>
-      <w:proofErr w:type="spellEnd"/>
-      <w:r>
-        <w:rPr>
-          <w:rFonts w:eastAsia="system-ui" w:cs="system-ui"/>
-          <w:color w:val="3B3B3B"/>
-          <w:sz w:val="21"/>
-          <w:szCs w:val="21"/>
-        </w:rPr>
-        <w:t xml:space="preserve"> cannot. And since dividing by 0 is not possible, this would cause an error. Instead of simply swapping the numerator and denominator, I decided to challenge myself to try and solve this problem by dropping the columns missing in the </w:t>
-      </w:r>
-      <w:proofErr w:type="spellStart"/>
-      <w:r>
-        <w:rPr>
-          <w:rFonts w:eastAsia="system-ui" w:cs="system-ui"/>
-          <w:color w:val="3B3B3B"/>
-          <w:sz w:val="21"/>
-          <w:szCs w:val="21"/>
-        </w:rPr>
-        <w:t>XGBoost</w:t>
-      </w:r>
-      <w:proofErr w:type="spellEnd"/>
-      <w:r>
-        <w:rPr>
-          <w:rFonts w:eastAsia="system-ui" w:cs="system-ui"/>
-          <w:color w:val="3B3B3B"/>
-          <w:sz w:val="21"/>
-          <w:szCs w:val="21"/>
-        </w:rPr>
-        <w:t xml:space="preserve"> importance list in the </w:t>
-      </w:r>
-      <w:proofErr w:type="spellStart"/>
-      <w:r>
-        <w:rPr>
-          <w:rFonts w:eastAsia="system-ui" w:cs="system-ui"/>
-          <w:color w:val="3B3B3B"/>
-          <w:sz w:val="21"/>
-          <w:szCs w:val="21"/>
-        </w:rPr>
-        <w:t>rfc</w:t>
-      </w:r>
-      <w:proofErr w:type="spellEnd"/>
-      <w:r>
-        <w:rPr>
-          <w:rFonts w:eastAsia="system-ui" w:cs="system-ui"/>
-          <w:color w:val="3B3B3B"/>
-          <w:sz w:val="21"/>
-          <w:szCs w:val="21"/>
-        </w:rPr>
-        <w:t xml:space="preserve"> list.</w:t>
+        <w:t>a combination of the importance identified by the random forest classifier (rfc) and XGBoost regressor. I divided the importance as given by the rfc by the importance given by XGBoost. This created a bit of a problem as XGBoost can remove features from its importance list while rfc cannot. And since dividing by 0 is not possible, this would cause an error. Instead of simply swapping the numerator and denominator, I decided to challenge myself to try and solve this problem by dropping the columns missing in the XGBoost importance list in the rfc list.</w:t>
       </w:r>
       <w:r>
         <w:rPr>
@@ -4837,27 +4275,7 @@
           <w:sz w:val="21"/>
           <w:szCs w:val="21"/>
         </w:rPr>
-        <w:t xml:space="preserve"> based </w:t>
-      </w:r>
-      <w:proofErr w:type="gramStart"/>
-      <w:r>
-        <w:rPr>
-          <w:rFonts w:eastAsia="system-ui" w:cs="system-ui"/>
-          <w:color w:val="3B3B3B"/>
-          <w:sz w:val="21"/>
-          <w:szCs w:val="21"/>
-        </w:rPr>
-        <w:t>off of</w:t>
-      </w:r>
-      <w:proofErr w:type="gramEnd"/>
-      <w:r>
-        <w:rPr>
-          <w:rFonts w:eastAsia="system-ui" w:cs="system-ui"/>
-          <w:color w:val="3B3B3B"/>
-          <w:sz w:val="21"/>
-          <w:szCs w:val="21"/>
-        </w:rPr>
-        <w:t xml:space="preserve"> that I</w:t>
+        <w:t xml:space="preserve"> based off of that I</w:t>
       </w:r>
       <w:r>
         <w:rPr>
@@ -4891,6 +4309,7 @@
           <w:rFonts w:eastAsia="system-ui"/>
           <w:color w:val="auto"/>
         </w:rPr>
+        <w:lastRenderedPageBreak/>
         <w:t>3.4.5 Model Evaluation After Feature Selection</w:t>
       </w:r>
     </w:p>
@@ -5001,23 +4420,7 @@
           <w:rFonts w:eastAsia="system-ui"/>
           <w:color w:val="auto"/>
         </w:rPr>
-        <w:t xml:space="preserve">3.5.1: </w:t>
-      </w:r>
-      <w:proofErr w:type="spellStart"/>
-      <w:r>
-        <w:rPr>
-          <w:rFonts w:eastAsia="system-ui"/>
-          <w:color w:val="auto"/>
-        </w:rPr>
-        <w:t>GridSearchCV</w:t>
-      </w:r>
-      <w:proofErr w:type="spellEnd"/>
-      <w:r>
-        <w:rPr>
-          <w:rFonts w:eastAsia="system-ui"/>
-          <w:color w:val="auto"/>
-        </w:rPr>
-        <w:t xml:space="preserve"> for Systematic Hyperparameter Tuning</w:t>
+        <w:t>3.5.1: GridSearchCV for Systematic Hyperparameter Tuning</w:t>
       </w:r>
     </w:p>
     <w:p>
@@ -5031,74 +4434,23 @@
           <w:szCs w:val="21"/>
         </w:rPr>
       </w:pPr>
-      <w:proofErr w:type="spellStart"/>
-      <w:r>
-        <w:rPr>
-          <w:rFonts w:eastAsia="system-ui" w:cs="system-ui"/>
-          <w:color w:val="3B3B3B"/>
-          <w:sz w:val="21"/>
-          <w:szCs w:val="21"/>
-        </w:rPr>
-        <w:t>GridSearchCV</w:t>
-      </w:r>
-      <w:proofErr w:type="spellEnd"/>
-      <w:r>
-        <w:rPr>
-          <w:rFonts w:eastAsia="system-ui" w:cs="system-ui"/>
-          <w:color w:val="3B3B3B"/>
-          <w:sz w:val="21"/>
-          <w:szCs w:val="21"/>
-        </w:rPr>
-        <w:t xml:space="preserve"> is a function that takes a grid of parameters and runs through all possible combinations. That is what I would use to tune the hyperparameters here. </w:t>
-      </w:r>
-      <w:r>
-        <w:rPr>
-          <w:rFonts w:eastAsia="system-ui" w:cs="system-ui"/>
-          <w:color w:val="3B3B3B"/>
-          <w:sz w:val="21"/>
-          <w:szCs w:val="21"/>
-        </w:rPr>
-        <w:t xml:space="preserve">The first step while using </w:t>
-      </w:r>
-      <w:proofErr w:type="spellStart"/>
-      <w:r>
-        <w:rPr>
-          <w:rFonts w:eastAsia="system-ui" w:cs="system-ui"/>
-          <w:color w:val="3B3B3B"/>
-          <w:sz w:val="21"/>
-          <w:szCs w:val="21"/>
-        </w:rPr>
-        <w:t>GridSearchCV</w:t>
-      </w:r>
-      <w:proofErr w:type="spellEnd"/>
-      <w:r>
-        <w:rPr>
-          <w:rFonts w:eastAsia="system-ui" w:cs="system-ui"/>
-          <w:color w:val="3B3B3B"/>
-          <w:sz w:val="21"/>
-          <w:szCs w:val="21"/>
-        </w:rPr>
-        <w:t xml:space="preserve"> is to create the parameter grid. I decided on tuning the hyperparameters of three models: decision tree regressor for regression, logistic regressor for classification and K-means for clustering. I created the grid for each of the models here. For the logistic regressor, I decided to include the ‘l1_ratio’ parameter, knowing it would make some of the folds fail as it was only required for the ‘</w:t>
-      </w:r>
-      <w:proofErr w:type="spellStart"/>
-      <w:r>
-        <w:rPr>
-          <w:rFonts w:eastAsia="system-ui" w:cs="system-ui"/>
-          <w:color w:val="3B3B3B"/>
-          <w:sz w:val="21"/>
-          <w:szCs w:val="21"/>
-        </w:rPr>
-        <w:t>elasticnet</w:t>
-      </w:r>
-      <w:proofErr w:type="spellEnd"/>
-      <w:r>
-        <w:rPr>
-          <w:rFonts w:eastAsia="system-ui" w:cs="system-ui"/>
-          <w:color w:val="3B3B3B"/>
-          <w:sz w:val="21"/>
-          <w:szCs w:val="21"/>
-        </w:rPr>
-        <w:t>’ penalty parameter.</w:t>
+      <w:r>
+        <w:rPr>
+          <w:rFonts w:eastAsia="system-ui" w:cs="system-ui"/>
+          <w:color w:val="3B3B3B"/>
+          <w:sz w:val="21"/>
+          <w:szCs w:val="21"/>
+        </w:rPr>
+        <w:t xml:space="preserve">GridSearchCV is a function that takes a grid of parameters and runs through all possible combinations. That is what I would use to tune the hyperparameters here. </w:t>
+      </w:r>
+      <w:r>
+        <w:rPr>
+          <w:rFonts w:eastAsia="system-ui" w:cs="system-ui"/>
+          <w:color w:val="3B3B3B"/>
+          <w:sz w:val="21"/>
+          <w:szCs w:val="21"/>
+        </w:rPr>
+        <w:t>The first step while using GridSearchCV is to create the parameter grid. I decided on tuning the hyperparameters of three models: decision tree regressor for regression, logistic regressor for classification and K-means for clustering. I created the grid for each of the models here. For the logistic regressor, I decided to include the ‘l1_ratio’ parameter, knowing it would make some of the folds fail as it was only required for the ‘elasticnet’ penalty parameter.</w:t>
       </w:r>
     </w:p>
     <w:p>
@@ -5114,23 +4466,7 @@
           <w:rFonts w:eastAsia="system-ui"/>
           <w:color w:val="auto"/>
         </w:rPr>
-        <w:t xml:space="preserve">3.5.2: Apply </w:t>
-      </w:r>
-      <w:proofErr w:type="spellStart"/>
-      <w:r>
-        <w:rPr>
-          <w:rFonts w:eastAsia="system-ui"/>
-          <w:color w:val="auto"/>
-        </w:rPr>
-        <w:t>GridSearchCV</w:t>
-      </w:r>
-      <w:proofErr w:type="spellEnd"/>
-      <w:r>
-        <w:rPr>
-          <w:rFonts w:eastAsia="system-ui"/>
-          <w:color w:val="auto"/>
-        </w:rPr>
-        <w:t xml:space="preserve"> with Cross-Validation</w:t>
+        <w:t>3.5.2: Apply GridSearchCV with Cross-Validation</w:t>
       </w:r>
     </w:p>
     <w:p>
@@ -5151,56 +4487,16 @@
           <w:sz w:val="21"/>
           <w:szCs w:val="21"/>
         </w:rPr>
-        <w:t xml:space="preserve">After creating the grid, I had to now use </w:t>
-      </w:r>
-      <w:proofErr w:type="spellStart"/>
-      <w:r>
-        <w:rPr>
-          <w:rFonts w:eastAsia="system-ui" w:cs="system-ui"/>
-          <w:color w:val="3B3B3B"/>
-          <w:sz w:val="21"/>
-          <w:szCs w:val="21"/>
-        </w:rPr>
-        <w:t>GridSearchCV</w:t>
-      </w:r>
-      <w:proofErr w:type="spellEnd"/>
-      <w:r>
-        <w:rPr>
-          <w:rFonts w:eastAsia="system-ui" w:cs="system-ui"/>
-          <w:color w:val="3B3B3B"/>
-          <w:sz w:val="21"/>
-          <w:szCs w:val="21"/>
-        </w:rPr>
-        <w:t xml:space="preserve"> with the </w:t>
-      </w:r>
-      <w:r>
-        <w:rPr>
-          <w:rFonts w:eastAsia="system-ui" w:cs="system-ui"/>
-          <w:color w:val="3B3B3B"/>
-          <w:sz w:val="21"/>
-          <w:szCs w:val="21"/>
-        </w:rPr>
-        <w:t xml:space="preserve">selected models. I split each count of </w:t>
-      </w:r>
-      <w:proofErr w:type="spellStart"/>
-      <w:r>
-        <w:rPr>
-          <w:rFonts w:eastAsia="system-ui" w:cs="system-ui"/>
-          <w:color w:val="3B3B3B"/>
-          <w:sz w:val="21"/>
-          <w:szCs w:val="21"/>
-        </w:rPr>
-        <w:t>GridSearchCV</w:t>
-      </w:r>
-      <w:proofErr w:type="spellEnd"/>
-      <w:r>
-        <w:rPr>
-          <w:rFonts w:eastAsia="system-ui" w:cs="system-ui"/>
-          <w:color w:val="3B3B3B"/>
-          <w:sz w:val="21"/>
-          <w:szCs w:val="21"/>
-        </w:rPr>
-        <w:t xml:space="preserve"> into its own cell as the process was computationally heavy and this would be helpful for debugging, since it wouldn’t require me to wait for the previous functions to finish before it showed an error.</w:t>
+        <w:t xml:space="preserve">After creating the grid, I had to now use GridSearchCV with the </w:t>
+      </w:r>
+      <w:r>
+        <w:rPr>
+          <w:rFonts w:eastAsia="system-ui" w:cs="system-ui"/>
+          <w:color w:val="3B3B3B"/>
+          <w:sz w:val="21"/>
+          <w:szCs w:val="21"/>
+        </w:rPr>
+        <w:t>selected models. I split each count of GridSearchCV into its own cell as the process was computationally heavy and this would be helpful for debugging, since it wouldn’t require me to wait for the previous functions to finish before it showed an error.</w:t>
       </w:r>
       <w:r>
         <w:rPr>
@@ -5225,7 +4521,6 @@
           <w:rFonts w:eastAsia="system-ui"/>
           <w:color w:val="auto"/>
         </w:rPr>
-        <w:lastRenderedPageBreak/>
         <w:t>3.5.3: Use Nested Cross-Validation to Validate Stability of Hyperparameters</w:t>
       </w:r>
     </w:p>
@@ -5247,27 +4542,7 @@
           <w:sz w:val="21"/>
           <w:szCs w:val="21"/>
         </w:rPr>
-        <w:t xml:space="preserve">After running the </w:t>
-      </w:r>
-      <w:proofErr w:type="spellStart"/>
-      <w:r>
-        <w:rPr>
-          <w:rFonts w:eastAsia="system-ui" w:cs="system-ui"/>
-          <w:color w:val="3B3B3B"/>
-          <w:sz w:val="21"/>
-          <w:szCs w:val="21"/>
-        </w:rPr>
-        <w:t>GridSearchCV</w:t>
-      </w:r>
-      <w:proofErr w:type="spellEnd"/>
-      <w:r>
-        <w:rPr>
-          <w:rFonts w:eastAsia="system-ui" w:cs="system-ui"/>
-          <w:color w:val="3B3B3B"/>
-          <w:sz w:val="21"/>
-          <w:szCs w:val="21"/>
-        </w:rPr>
-        <w:t xml:space="preserve"> it was time to check how well it had performed. For this purpose, I used nested cross-validation</w:t>
+        <w:t>After running the GridSearchCV it was time to check how well it had performed. For this purpose, I used nested cross-validation</w:t>
       </w:r>
       <w:r>
         <w:rPr>
@@ -5340,27 +4615,7 @@
           <w:sz w:val="21"/>
           <w:szCs w:val="21"/>
         </w:rPr>
-        <w:t xml:space="preserve"> Evaluated the models using the metrics I evaluated them earlier with, except for clustering, which only had 1 metric originally. I calculated the </w:t>
-      </w:r>
-      <w:proofErr w:type="spellStart"/>
-      <w:r>
-        <w:rPr>
-          <w:rFonts w:eastAsia="system-ui" w:cs="system-ui"/>
-          <w:color w:val="3B3B3B"/>
-          <w:sz w:val="21"/>
-          <w:szCs w:val="21"/>
-        </w:rPr>
-        <w:t>Calinski-Harabasz</w:t>
-      </w:r>
-      <w:proofErr w:type="spellEnd"/>
-      <w:r>
-        <w:rPr>
-          <w:rFonts w:eastAsia="system-ui" w:cs="system-ui"/>
-          <w:color w:val="3B3B3B"/>
-          <w:sz w:val="21"/>
-          <w:szCs w:val="21"/>
-        </w:rPr>
-        <w:t xml:space="preserve"> index for the tuned K-means model.</w:t>
+        <w:t xml:space="preserve"> Evaluated the models using the metrics I evaluated them earlier with, except for clustering, which only had 1 metric originally. I calculated the Calinski-Harabasz index for the tuned K-means model.</w:t>
       </w:r>
     </w:p>
     <w:p>
@@ -5376,6 +4631,7 @@
           <w:rFonts w:eastAsia="system-ui"/>
           <w:color w:val="auto"/>
         </w:rPr>
+        <w:lastRenderedPageBreak/>
         <w:t>Task 3.6: Model Selection</w:t>
       </w:r>
     </w:p>
@@ -5489,47 +4745,7 @@
           <w:sz w:val="21"/>
           <w:szCs w:val="21"/>
         </w:rPr>
-        <w:t xml:space="preserve">The very final step in this creative brief was to save all three models using </w:t>
-      </w:r>
-      <w:proofErr w:type="spellStart"/>
-      <w:r>
-        <w:rPr>
-          <w:rFonts w:eastAsia="system-ui" w:cs="system-ui"/>
-          <w:color w:val="3B3B3B"/>
-          <w:sz w:val="21"/>
-          <w:szCs w:val="21"/>
-        </w:rPr>
-        <w:t>joblib</w:t>
-      </w:r>
-      <w:proofErr w:type="spellEnd"/>
-      <w:r>
-        <w:rPr>
-          <w:rFonts w:eastAsia="system-ui" w:cs="system-ui"/>
-          <w:color w:val="3B3B3B"/>
-          <w:sz w:val="21"/>
-          <w:szCs w:val="21"/>
-        </w:rPr>
-        <w:t xml:space="preserve">. I already trained all models on the full dataset, so all I had to do was use </w:t>
-      </w:r>
-      <w:proofErr w:type="spellStart"/>
-      <w:r>
-        <w:rPr>
-          <w:rFonts w:eastAsia="system-ui" w:cs="system-ui"/>
-          <w:color w:val="3B3B3B"/>
-          <w:sz w:val="21"/>
-          <w:szCs w:val="21"/>
-        </w:rPr>
-        <w:t>joblib.dump</w:t>
-      </w:r>
-      <w:proofErr w:type="spellEnd"/>
-      <w:r>
-        <w:rPr>
-          <w:rFonts w:eastAsia="system-ui" w:cs="system-ui"/>
-          <w:color w:val="3B3B3B"/>
-          <w:sz w:val="21"/>
-          <w:szCs w:val="21"/>
-        </w:rPr>
-        <w:t xml:space="preserve"> to save the models to a file. A problem I encountered with this was the fact that the random forest classifier model would save to a file that is 1.16GB large. This is a problem because GitHub had a file upload limit of 100mb. After compressing the file as much as I could it was still almost 50% over the limit at 145mb. I decided that I could not upload this file to my GitHub repository.</w:t>
+        <w:t>The very final step in this creative brief was to save all three models using joblib. I already trained all models on the full dataset, so all I had to do was use joblib.dump to save the models to a file. A problem I encountered with this was the fact that the random forest classifier model would save to a file that is 1.16GB large. This is a problem because GitHub had a file upload limit of 100mb. After compressing the file as much as I could it was still almost 50% over the limit at 145mb. I decided that I could not upload this file to my GitHub repository.</w:t>
       </w:r>
     </w:p>
     <w:p>
@@ -5577,27 +4793,7 @@
           <w:sz w:val="21"/>
           <w:szCs w:val="21"/>
         </w:rPr>
-        <w:t xml:space="preserve">After </w:t>
-      </w:r>
-      <w:proofErr w:type="gramStart"/>
-      <w:r>
-        <w:rPr>
-          <w:rFonts w:eastAsia="system-ui" w:cs="system-ui"/>
-          <w:color w:val="3B3B3B"/>
-          <w:sz w:val="21"/>
-          <w:szCs w:val="21"/>
-        </w:rPr>
-        <w:t>all of</w:t>
-      </w:r>
-      <w:proofErr w:type="gramEnd"/>
-      <w:r>
-        <w:rPr>
-          <w:rFonts w:eastAsia="system-ui" w:cs="system-ui"/>
-          <w:color w:val="3B3B3B"/>
-          <w:sz w:val="21"/>
-          <w:szCs w:val="21"/>
-        </w:rPr>
-        <w:t xml:space="preserve"> this work, </w:t>
+        <w:t xml:space="preserve">After all of this work, </w:t>
       </w:r>
       <w:r>
         <w:rPr>
@@ -5693,37 +4889,7 @@
           <w:sz w:val="21"/>
           <w:szCs w:val="21"/>
         </w:rPr>
-        <w:t xml:space="preserve">, analysis of my work and its results reveals a bit of nuance: namely, gradient boosting lost by a small amount and </w:t>
-      </w:r>
-      <w:proofErr w:type="spellStart"/>
-      <w:r>
-        <w:rPr>
-          <w:rFonts w:eastAsia="system-ui" w:cs="system-ui"/>
-          <w:color w:val="3B3B3B"/>
-          <w:sz w:val="21"/>
-          <w:szCs w:val="21"/>
-        </w:rPr>
-        <w:t>XGBoost</w:t>
-      </w:r>
-      <w:proofErr w:type="spellEnd"/>
-      <w:r>
-        <w:rPr>
-          <w:rFonts w:eastAsia="system-ui" w:cs="system-ui"/>
-          <w:color w:val="3B3B3B"/>
-          <w:sz w:val="21"/>
-          <w:szCs w:val="21"/>
-        </w:rPr>
-        <w:t xml:space="preserve"> had problems which required </w:t>
-      </w:r>
-      <w:r>
-        <w:rPr>
-          <w:rFonts w:eastAsia="system-ui" w:cs="system-ui"/>
-          <w:color w:val="3B3B3B"/>
-          <w:sz w:val="21"/>
-          <w:szCs w:val="21"/>
-        </w:rPr>
-        <w:lastRenderedPageBreak/>
-        <w:t>changing the data a bit for them to be solved. This could potentially mean that I made errors in my work which if done correctly, could have led to a different outcome.</w:t>
+        <w:t>, analysis of my work and its results reveals a bit of nuance: namely, gradient boosting lost by a small amount and XGBoost had problems which required changing the data a bit for them to be solved. This could potentially mean that I made errors in my work which if done correctly, could have led to a different outcome.</w:t>
       </w:r>
     </w:p>
     <w:p>
@@ -5801,27 +4967,7 @@
           <w:sz w:val="21"/>
           <w:szCs w:val="21"/>
         </w:rPr>
-        <w:t xml:space="preserve"> it only gets 31% of </w:t>
-      </w:r>
-      <w:proofErr w:type="spellStart"/>
-      <w:r>
-        <w:rPr>
-          <w:rFonts w:eastAsia="system-ui" w:cs="system-ui"/>
-          <w:color w:val="3B3B3B"/>
-          <w:sz w:val="21"/>
-          <w:szCs w:val="21"/>
-        </w:rPr>
-        <w:t>it’s</w:t>
-      </w:r>
-      <w:proofErr w:type="spellEnd"/>
-      <w:r>
-        <w:rPr>
-          <w:rFonts w:eastAsia="system-ui" w:cs="system-ui"/>
-          <w:color w:val="3B3B3B"/>
-          <w:sz w:val="21"/>
-          <w:szCs w:val="21"/>
-        </w:rPr>
-        <w:t xml:space="preserve"> </w:t>
+        <w:t xml:space="preserve"> it only gets 31% of it’s </w:t>
       </w:r>
       <w:r>
         <w:rPr>
@@ -5926,7 +5072,17 @@
           <w:sz w:val="21"/>
           <w:szCs w:val="21"/>
         </w:rPr>
-        <w:t>in this category and while no errors seem to be obvious, doubt that is caused by the results in the other two tasks could be reason for further investigation of my results.</w:t>
+        <w:t xml:space="preserve">in this category and while no errors seem to be obvious, doubt </w:t>
+      </w:r>
+      <w:r>
+        <w:rPr>
+          <w:rFonts w:eastAsia="system-ui" w:cs="system-ui"/>
+          <w:color w:val="3B3B3B"/>
+          <w:sz w:val="21"/>
+          <w:szCs w:val="21"/>
+        </w:rPr>
+        <w:lastRenderedPageBreak/>
+        <w:t>that is caused by the results in the other two tasks could be reason for further investigation of my results.</w:t>
       </w:r>
     </w:p>
     <w:p>

</xml_diff>